<commit_message>
docs: update change list — add #6b priority strip color fix, 7 done 2 skipped 25 remaining
</commit_message>
<xml_diff>
--- a/Updated_Change_List.docx
+++ b/Updated_Change_List.docx
@@ -3,2203 +3,273 @@
 <w:document xmlns:wpc="http://schemas.microsoft.com/office/word/2010/wordprocessingCanvas" xmlns:mo="http://schemas.microsoft.com/office/mac/office/2008/main" xmlns:mc="http://schemas.openxmlformats.org/markup-compatibility/2006" xmlns:mv="urn:schemas-microsoft-com:mac:vml" xmlns:o="urn:schemas-microsoft-com:office:office" xmlns:r="http://schemas.openxmlformats.org/officeDocument/2006/relationships" xmlns:m="http://schemas.openxmlformats.org/officeDocument/2006/math" xmlns:v="urn:schemas-microsoft-com:vml" xmlns:wp14="http://schemas.microsoft.com/office/word/2010/wordprocessingDrawing" xmlns:wp="http://schemas.openxmlformats.org/drawingml/2006/wordprocessingDrawing" xmlns:w10="urn:schemas-microsoft-com:office:word" xmlns:w="http://schemas.openxmlformats.org/wordprocessingml/2006/main" xmlns:w14="http://schemas.microsoft.com/office/word/2010/wordml" xmlns:wpg="http://schemas.microsoft.com/office/word/2010/wordprocessingGroup" xmlns:wpi="http://schemas.microsoft.com/office/word/2010/wordprocessingInk" xmlns:wne="http://schemas.microsoft.com/office/word/2006/wordml" xmlns:wps="http://schemas.microsoft.com/office/word/2010/wordprocessingShape" mc:Ignorable="w14 wp14">
   <w:body>
     <w:p>
-      <w:pPr>
-        <w:pStyle w:val="Title"/>
-        <w:jc w:val="left"/>
-      </w:pPr>
       <w:r>
-        <w:t>Updated Change List</w:t>
+        <w:t>## Updated Change List</w:t>
       </w:r>
     </w:p>
     <w:p>
       <w:r>
-        <w:rPr>
-          <w:b/>
-          <w:color w:val="003399"/>
-          <w:sz w:val="22"/>
-        </w:rPr>
-        <w:t>Decision OS · Last Updated: April 9, 2026</w:t>
+        <w:t>### 🔴 CRITICAL — Security Fixes</w:t>
+      </w:r>
+    </w:p>
+    <w:p>
+      <w:r>
+        <w:t>| # | Change | Status | Dev | Production (Render) |</w:t>
+      </w:r>
+    </w:p>
+    <w:p>
+      <w:r>
+        <w:t>|---|--------|--------|-----|---------------------|</w:t>
+      </w:r>
+    </w:p>
+    <w:p>
+      <w:r>
+        <w:t>| 1 | Protect `/api/pull` | ✅ Done | Works as-is | Blocked |</w:t>
+      </w:r>
+    </w:p>
+    <w:p>
+      <w:r>
+        <w:t>| 2 | Fix CORS | ✅ Done | Open | Whitelist only |</w:t>
+      </w:r>
+    </w:p>
+    <w:p>
+      <w:r>
+        <w:t>| 3 | Remove plaintext passwords | ⏭️ Skip | — | Bundled with #33 |</w:t>
+      </w:r>
+    </w:p>
+    <w:p>
+      <w:r>
+        <w:t>| 4 | Add API auth middleware | ⏭️ Skip | — | Bundled with #33 |</w:t>
+      </w:r>
+    </w:p>
+    <w:p>
+      <w:r>
+        <w:t>| 5 | Add security headers (Helmet.js) | ✅ Done | Works | Full headers + HSTS |</w:t>
       </w:r>
     </w:p>
     <w:p/>
     <w:p>
-      <w:pPr>
-        <w:pStyle w:val="Heading2"/>
-      </w:pPr>
       <w:r>
-        <w:t>🔴 CRITICAL — Security Fixes</w:t>
-      </w:r>
-    </w:p>
-    <w:tbl>
-      <w:tblPr>
-        <w:tblStyle w:val="LightGrid-Accent1"/>
-        <w:tblW w:type="auto" w:w="0"/>
-        <w:tblLook w:firstColumn="1" w:firstRow="1" w:lastColumn="0" w:lastRow="0" w:noHBand="0" w:noVBand="1" w:val="04A0"/>
-      </w:tblPr>
-      <w:tblGrid>
-        <w:gridCol w:w="1728"/>
-        <w:gridCol w:w="1728"/>
-        <w:gridCol w:w="1728"/>
-        <w:gridCol w:w="1728"/>
-        <w:gridCol w:w="1728"/>
-      </w:tblGrid>
-      <w:tr>
-        <w:tc>
-          <w:tcPr>
-            <w:tcW w:type="dxa" w:w="1728"/>
-          </w:tcPr>
-          <w:p>
-            <w:r>
-              <w:t>#</w:t>
-            </w:r>
-          </w:p>
-        </w:tc>
-        <w:tc>
-          <w:tcPr>
-            <w:tcW w:type="dxa" w:w="1728"/>
-          </w:tcPr>
-          <w:p>
-            <w:r>
-              <w:t>Change</w:t>
-            </w:r>
-          </w:p>
-        </w:tc>
-        <w:tc>
-          <w:tcPr>
-            <w:tcW w:type="dxa" w:w="1728"/>
-          </w:tcPr>
-          <w:p>
-            <w:r>
-              <w:t>Status</w:t>
-            </w:r>
-          </w:p>
-        </w:tc>
-        <w:tc>
-          <w:tcPr>
-            <w:tcW w:type="dxa" w:w="1728"/>
-          </w:tcPr>
-          <w:p>
-            <w:r>
-              <w:t>Dev</w:t>
-            </w:r>
-          </w:p>
-        </w:tc>
-        <w:tc>
-          <w:tcPr>
-            <w:tcW w:type="dxa" w:w="1728"/>
-          </w:tcPr>
-          <w:p>
-            <w:r>
-              <w:t>Production (Render)</w:t>
-            </w:r>
-          </w:p>
-        </w:tc>
-      </w:tr>
-      <w:tr>
-        <w:tc>
-          <w:tcPr>
-            <w:tcW w:type="dxa" w:w="1728"/>
-          </w:tcPr>
-          <w:p>
-            <w:r>
-              <w:t>1</w:t>
-            </w:r>
-          </w:p>
-        </w:tc>
-        <w:tc>
-          <w:tcPr>
-            <w:tcW w:type="dxa" w:w="1728"/>
-          </w:tcPr>
-          <w:p>
-            <w:r>
-              <w:t>Protect `/api/pull`</w:t>
-            </w:r>
-          </w:p>
-        </w:tc>
-        <w:tc>
-          <w:tcPr>
-            <w:tcW w:type="dxa" w:w="1728"/>
-          </w:tcPr>
-          <w:p>
-            <w:r>
-              <w:t>✅ Done</w:t>
-            </w:r>
-          </w:p>
-        </w:tc>
-        <w:tc>
-          <w:tcPr>
-            <w:tcW w:type="dxa" w:w="1728"/>
-          </w:tcPr>
-          <w:p>
-            <w:r>
-              <w:t>Works as-is</w:t>
-            </w:r>
-          </w:p>
-        </w:tc>
-        <w:tc>
-          <w:tcPr>
-            <w:tcW w:type="dxa" w:w="1728"/>
-          </w:tcPr>
-          <w:p>
-            <w:r>
-              <w:t>Blocked</w:t>
-            </w:r>
-          </w:p>
-        </w:tc>
-      </w:tr>
-      <w:tr>
-        <w:tc>
-          <w:tcPr>
-            <w:tcW w:type="dxa" w:w="1728"/>
-          </w:tcPr>
-          <w:p>
-            <w:r>
-              <w:t>2</w:t>
-            </w:r>
-          </w:p>
-        </w:tc>
-        <w:tc>
-          <w:tcPr>
-            <w:tcW w:type="dxa" w:w="1728"/>
-          </w:tcPr>
-          <w:p>
-            <w:r>
-              <w:t>Fix CORS</w:t>
-            </w:r>
-          </w:p>
-        </w:tc>
-        <w:tc>
-          <w:tcPr>
-            <w:tcW w:type="dxa" w:w="1728"/>
-          </w:tcPr>
-          <w:p>
-            <w:r>
-              <w:t>✅ Done</w:t>
-            </w:r>
-          </w:p>
-        </w:tc>
-        <w:tc>
-          <w:tcPr>
-            <w:tcW w:type="dxa" w:w="1728"/>
-          </w:tcPr>
-          <w:p>
-            <w:r>
-              <w:t>Open</w:t>
-            </w:r>
-          </w:p>
-        </w:tc>
-        <w:tc>
-          <w:tcPr>
-            <w:tcW w:type="dxa" w:w="1728"/>
-          </w:tcPr>
-          <w:p>
-            <w:r>
-              <w:t>Whitelist only</w:t>
-            </w:r>
-          </w:p>
-        </w:tc>
-      </w:tr>
-      <w:tr>
-        <w:tc>
-          <w:tcPr>
-            <w:tcW w:type="dxa" w:w="1728"/>
-          </w:tcPr>
-          <w:p>
-            <w:r>
-              <w:t>3</w:t>
-            </w:r>
-          </w:p>
-        </w:tc>
-        <w:tc>
-          <w:tcPr>
-            <w:tcW w:type="dxa" w:w="1728"/>
-          </w:tcPr>
-          <w:p>
-            <w:r>
-              <w:t>Remove plaintext passwords</w:t>
-            </w:r>
-          </w:p>
-        </w:tc>
-        <w:tc>
-          <w:tcPr>
-            <w:tcW w:type="dxa" w:w="1728"/>
-          </w:tcPr>
-          <w:p>
-            <w:r>
-              <w:t>⏭️ Skip</w:t>
-            </w:r>
-          </w:p>
-        </w:tc>
-        <w:tc>
-          <w:tcPr>
-            <w:tcW w:type="dxa" w:w="1728"/>
-          </w:tcPr>
-          <w:p>
-            <w:r>
-              <w:t>—</w:t>
-            </w:r>
-          </w:p>
-        </w:tc>
-        <w:tc>
-          <w:tcPr>
-            <w:tcW w:type="dxa" w:w="1728"/>
-          </w:tcPr>
-          <w:p>
-            <w:r>
-              <w:t>Bundled with #33</w:t>
-            </w:r>
-          </w:p>
-        </w:tc>
-      </w:tr>
-      <w:tr>
-        <w:tc>
-          <w:tcPr>
-            <w:tcW w:type="dxa" w:w="1728"/>
-          </w:tcPr>
-          <w:p>
-            <w:r>
-              <w:t>4</w:t>
-            </w:r>
-          </w:p>
-        </w:tc>
-        <w:tc>
-          <w:tcPr>
-            <w:tcW w:type="dxa" w:w="1728"/>
-          </w:tcPr>
-          <w:p>
-            <w:r>
-              <w:t>Add API auth middleware</w:t>
-            </w:r>
-          </w:p>
-        </w:tc>
-        <w:tc>
-          <w:tcPr>
-            <w:tcW w:type="dxa" w:w="1728"/>
-          </w:tcPr>
-          <w:p>
-            <w:r>
-              <w:t>⏭️ Skip</w:t>
-            </w:r>
-          </w:p>
-        </w:tc>
-        <w:tc>
-          <w:tcPr>
-            <w:tcW w:type="dxa" w:w="1728"/>
-          </w:tcPr>
-          <w:p>
-            <w:r>
-              <w:t>—</w:t>
-            </w:r>
-          </w:p>
-        </w:tc>
-        <w:tc>
-          <w:tcPr>
-            <w:tcW w:type="dxa" w:w="1728"/>
-          </w:tcPr>
-          <w:p>
-            <w:r>
-              <w:t>Bundled with #33</w:t>
-            </w:r>
-          </w:p>
-        </w:tc>
-      </w:tr>
-      <w:tr>
-        <w:tc>
-          <w:tcPr>
-            <w:tcW w:type="dxa" w:w="1728"/>
-          </w:tcPr>
-          <w:p>
-            <w:r>
-              <w:t>5</w:t>
-            </w:r>
-          </w:p>
-        </w:tc>
-        <w:tc>
-          <w:tcPr>
-            <w:tcW w:type="dxa" w:w="1728"/>
-          </w:tcPr>
-          <w:p>
-            <w:r>
-              <w:t>Add security headers (Helmet.js)</w:t>
-            </w:r>
-          </w:p>
-        </w:tc>
-        <w:tc>
-          <w:tcPr>
-            <w:tcW w:type="dxa" w:w="1728"/>
-          </w:tcPr>
-          <w:p>
-            <w:r>
-              <w:t>✅ Done</w:t>
-            </w:r>
-          </w:p>
-        </w:tc>
-        <w:tc>
-          <w:tcPr>
-            <w:tcW w:type="dxa" w:w="1728"/>
-          </w:tcPr>
-          <w:p>
-            <w:r>
-              <w:t>Works</w:t>
-            </w:r>
-          </w:p>
-        </w:tc>
-        <w:tc>
-          <w:tcPr>
-            <w:tcW w:type="dxa" w:w="1728"/>
-          </w:tcPr>
-          <w:p>
-            <w:r>
-              <w:t>Full headers + HSTS</w:t>
-            </w:r>
-          </w:p>
-        </w:tc>
-      </w:tr>
-    </w:tbl>
-    <w:p/>
-    <w:p>
-      <w:pPr>
-        <w:pStyle w:val="Heading2"/>
-      </w:pPr>
-      <w:r>
-        <w:t>🟡 HIGH — UX Redesign (from Decision System Lab spec)</w:t>
-      </w:r>
-    </w:p>
-    <w:tbl>
-      <w:tblPr>
-        <w:tblStyle w:val="LightGrid-Accent1"/>
-        <w:tblW w:type="auto" w:w="0"/>
-        <w:tblLook w:firstColumn="1" w:firstRow="1" w:lastColumn="0" w:lastRow="0" w:noHBand="0" w:noVBand="1" w:val="04A0"/>
-      </w:tblPr>
-      <w:tblGrid>
-        <w:gridCol w:w="1728"/>
-        <w:gridCol w:w="1728"/>
-        <w:gridCol w:w="1728"/>
-        <w:gridCol w:w="1728"/>
-        <w:gridCol w:w="1728"/>
-      </w:tblGrid>
-      <w:tr>
-        <w:tc>
-          <w:tcPr>
-            <w:tcW w:type="dxa" w:w="1728"/>
-          </w:tcPr>
-          <w:p>
-            <w:r>
-              <w:t>#</w:t>
-            </w:r>
-          </w:p>
-        </w:tc>
-        <w:tc>
-          <w:tcPr>
-            <w:tcW w:type="dxa" w:w="1728"/>
-          </w:tcPr>
-          <w:p>
-            <w:r>
-              <w:t>Change</w:t>
-            </w:r>
-          </w:p>
-        </w:tc>
-        <w:tc>
-          <w:tcPr>
-            <w:tcW w:type="dxa" w:w="1728"/>
-          </w:tcPr>
-          <w:p>
-            <w:r>
-              <w:t>Status</w:t>
-            </w:r>
-          </w:p>
-        </w:tc>
-        <w:tc>
-          <w:tcPr>
-            <w:tcW w:type="dxa" w:w="1728"/>
-          </w:tcPr>
-          <w:p>
-            <w:r>
-              <w:t>Dev</w:t>
-            </w:r>
-          </w:p>
-        </w:tc>
-        <w:tc>
-          <w:tcPr>
-            <w:tcW w:type="dxa" w:w="1728"/>
-          </w:tcPr>
-          <w:p>
-            <w:r>
-              <w:t>Production (Render)</w:t>
-            </w:r>
-          </w:p>
-        </w:tc>
-      </w:tr>
-      <w:tr>
-        <w:tc>
-          <w:tcPr>
-            <w:tcW w:type="dxa" w:w="1728"/>
-          </w:tcPr>
-          <w:p>
-            <w:r>
-              <w:t>6</w:t>
-            </w:r>
-          </w:p>
-        </w:tc>
-        <w:tc>
-          <w:tcPr>
-            <w:tcW w:type="dxa" w:w="1728"/>
-          </w:tcPr>
-          <w:p>
-            <w:r>
-              <w:t>Build Decision Priority Strip</w:t>
-            </w:r>
-          </w:p>
-        </w:tc>
-        <w:tc>
-          <w:tcPr>
-            <w:tcW w:type="dxa" w:w="1728"/>
-          </w:tcPr>
-          <w:p>
-            <w:r>
-              <w:t>✅ Done</w:t>
-            </w:r>
-          </w:p>
-        </w:tc>
-        <w:tc>
-          <w:tcPr>
-            <w:tcW w:type="dxa" w:w="1728"/>
-          </w:tcPr>
-          <w:p>
-            <w:r>
-              <w:t>Works</w:t>
-            </w:r>
-          </w:p>
-        </w:tc>
-        <w:tc>
-          <w:tcPr>
-            <w:tcW w:type="dxa" w:w="1728"/>
-          </w:tcPr>
-          <w:p>
-            <w:r>
-              <w:t>Works</w:t>
-            </w:r>
-          </w:p>
-        </w:tc>
-      </w:tr>
-      <w:tr>
-        <w:tc>
-          <w:tcPr>
-            <w:tcW w:type="dxa" w:w="1728"/>
-          </w:tcPr>
-          <w:p>
-            <w:r>
-              <w:t>6b</w:t>
-            </w:r>
-          </w:p>
-        </w:tc>
-        <w:tc>
-          <w:tcPr>
-            <w:tcW w:type="dxa" w:w="1728"/>
-          </w:tcPr>
-          <w:p>
-            <w:r>
-              <w:t>Fix priority strip label/icon colors — signature palette</w:t>
-            </w:r>
-          </w:p>
-        </w:tc>
-        <w:tc>
-          <w:tcPr>
-            <w:tcW w:type="dxa" w:w="1728"/>
-          </w:tcPr>
-          <w:p>
-            <w:r>
-              <w:t>✅ Done</w:t>
-            </w:r>
-          </w:p>
-        </w:tc>
-        <w:tc>
-          <w:tcPr>
-            <w:tcW w:type="dxa" w:w="1728"/>
-          </w:tcPr>
-          <w:p>
-            <w:r>
-              <w:t>Navy + Gold</w:t>
-            </w:r>
-          </w:p>
-        </w:tc>
-        <w:tc>
-          <w:tcPr>
-            <w:tcW w:type="dxa" w:w="1728"/>
-          </w:tcPr>
-          <w:p>
-            <w:r>
-              <w:t>Navy + Gold</w:t>
-            </w:r>
-          </w:p>
-        </w:tc>
-      </w:tr>
-      <w:tr>
-        <w:tc>
-          <w:tcPr>
-            <w:tcW w:type="dxa" w:w="1728"/>
-          </w:tcPr>
-          <w:p>
-            <w:r>
-              <w:t>7</w:t>
-            </w:r>
-          </w:p>
-        </w:tc>
-        <w:tc>
-          <w:tcPr>
-            <w:tcW w:type="dxa" w:w="1728"/>
-          </w:tcPr>
-          <w:p>
-            <w:r>
-              <w:t>Build structured Decision Cards</w:t>
-            </w:r>
-          </w:p>
-        </w:tc>
-        <w:tc>
-          <w:tcPr>
-            <w:tcW w:type="dxa" w:w="1728"/>
-          </w:tcPr>
-          <w:p>
-            <w:r>
-              <w:t>🔲 Pending</w:t>
-            </w:r>
-          </w:p>
-        </w:tc>
-        <w:tc>
-          <w:tcPr>
-            <w:tcW w:type="dxa" w:w="1728"/>
-          </w:tcPr>
-          <w:p>
-            <w:r>
-              <w:t>Same UI</w:t>
-            </w:r>
-          </w:p>
-        </w:tc>
-        <w:tc>
-          <w:tcPr>
-            <w:tcW w:type="dxa" w:w="1728"/>
-          </w:tcPr>
-          <w:p>
-            <w:r>
-              <w:t>Same UI</w:t>
-            </w:r>
-          </w:p>
-        </w:tc>
-      </w:tr>
-      <w:tr>
-        <w:tc>
-          <w:tcPr>
-            <w:tcW w:type="dxa" w:w="1728"/>
-          </w:tcPr>
-          <w:p>
-            <w:r>
-              <w:t>8</w:t>
-            </w:r>
-          </w:p>
-        </w:tc>
-        <w:tc>
-          <w:tcPr>
-            <w:tcW w:type="dxa" w:w="1728"/>
-          </w:tcPr>
-          <w:p>
-            <w:r>
-              <w:t>Build Drill-Down Side Panel</w:t>
-            </w:r>
-          </w:p>
-        </w:tc>
-        <w:tc>
-          <w:tcPr>
-            <w:tcW w:type="dxa" w:w="1728"/>
-          </w:tcPr>
-          <w:p>
-            <w:r>
-              <w:t>🔲 Pending</w:t>
-            </w:r>
-          </w:p>
-        </w:tc>
-        <w:tc>
-          <w:tcPr>
-            <w:tcW w:type="dxa" w:w="1728"/>
-          </w:tcPr>
-          <w:p>
-            <w:r>
-              <w:t>Same UI</w:t>
-            </w:r>
-          </w:p>
-        </w:tc>
-        <w:tc>
-          <w:tcPr>
-            <w:tcW w:type="dxa" w:w="1728"/>
-          </w:tcPr>
-          <w:p>
-            <w:r>
-              <w:t>Same UI</w:t>
-            </w:r>
-          </w:p>
-        </w:tc>
-      </w:tr>
-      <w:tr>
-        <w:tc>
-          <w:tcPr>
-            <w:tcW w:type="dxa" w:w="1728"/>
-          </w:tcPr>
-          <w:p>
-            <w:r>
-              <w:t>9</w:t>
-            </w:r>
-          </w:p>
-        </w:tc>
-        <w:tc>
-          <w:tcPr>
-            <w:tcW w:type="dxa" w:w="1728"/>
-          </w:tcPr>
-          <w:p>
-            <w:r>
-              <w:t>Build Domain Tabs with sub-filters</w:t>
-            </w:r>
-          </w:p>
-        </w:tc>
-        <w:tc>
-          <w:tcPr>
-            <w:tcW w:type="dxa" w:w="1728"/>
-          </w:tcPr>
-          <w:p>
-            <w:r>
-              <w:t>🔲 Pending</w:t>
-            </w:r>
-          </w:p>
-        </w:tc>
-        <w:tc>
-          <w:tcPr>
-            <w:tcW w:type="dxa" w:w="1728"/>
-          </w:tcPr>
-          <w:p>
-            <w:r>
-              <w:t>Same UI</w:t>
-            </w:r>
-          </w:p>
-        </w:tc>
-        <w:tc>
-          <w:tcPr>
-            <w:tcW w:type="dxa" w:w="1728"/>
-          </w:tcPr>
-          <w:p>
-            <w:r>
-              <w:t>Same UI</w:t>
-            </w:r>
-          </w:p>
-        </w:tc>
-      </w:tr>
-      <w:tr>
-        <w:tc>
-          <w:tcPr>
-            <w:tcW w:type="dxa" w:w="1728"/>
-          </w:tcPr>
-          <w:p>
-            <w:r>
-              <w:t>10</w:t>
-            </w:r>
-          </w:p>
-        </w:tc>
-        <w:tc>
-          <w:tcPr>
-            <w:tcW w:type="dxa" w:w="1728"/>
-          </w:tcPr>
-          <w:p>
-            <w:r>
-              <w:t>Add Portal Switcher dropdown</w:t>
-            </w:r>
-          </w:p>
-        </w:tc>
-        <w:tc>
-          <w:tcPr>
-            <w:tcW w:type="dxa" w:w="1728"/>
-          </w:tcPr>
-          <w:p>
-            <w:r>
-              <w:t>🔲 Pending</w:t>
-            </w:r>
-          </w:p>
-        </w:tc>
-        <w:tc>
-          <w:tcPr>
-            <w:tcW w:type="dxa" w:w="1728"/>
-          </w:tcPr>
-          <w:p>
-            <w:r>
-              <w:t>Same UI</w:t>
-            </w:r>
-          </w:p>
-        </w:tc>
-        <w:tc>
-          <w:tcPr>
-            <w:tcW w:type="dxa" w:w="1728"/>
-          </w:tcPr>
-          <w:p>
-            <w:r>
-              <w:t>Same UI</w:t>
-            </w:r>
-          </w:p>
-        </w:tc>
-      </w:tr>
-      <w:tr>
-        <w:tc>
-          <w:tcPr>
-            <w:tcW w:type="dxa" w:w="1728"/>
-          </w:tcPr>
-          <w:p>
-            <w:r>
-              <w:t>11</w:t>
-            </w:r>
-          </w:p>
-        </w:tc>
-        <w:tc>
-          <w:tcPr>
-            <w:tcW w:type="dxa" w:w="1728"/>
-          </w:tcPr>
-          <w:p>
-            <w:r>
-              <w:t>Add skeleton loading states</w:t>
-            </w:r>
-          </w:p>
-        </w:tc>
-        <w:tc>
-          <w:tcPr>
-            <w:tcW w:type="dxa" w:w="1728"/>
-          </w:tcPr>
-          <w:p>
-            <w:r>
-              <w:t>🔲 Pending</w:t>
-            </w:r>
-          </w:p>
-        </w:tc>
-        <w:tc>
-          <w:tcPr>
-            <w:tcW w:type="dxa" w:w="1728"/>
-          </w:tcPr>
-          <w:p>
-            <w:r>
-              <w:t>Same UI</w:t>
-            </w:r>
-          </w:p>
-        </w:tc>
-        <w:tc>
-          <w:tcPr>
-            <w:tcW w:type="dxa" w:w="1728"/>
-          </w:tcPr>
-          <w:p>
-            <w:r>
-              <w:t>Same UI</w:t>
-            </w:r>
-          </w:p>
-        </w:tc>
-      </w:tr>
-      <w:tr>
-        <w:tc>
-          <w:tcPr>
-            <w:tcW w:type="dxa" w:w="1728"/>
-          </w:tcPr>
-          <w:p>
-            <w:r>
-              <w:t>12</w:t>
-            </w:r>
-          </w:p>
-        </w:tc>
-        <w:tc>
-          <w:tcPr>
-            <w:tcW w:type="dxa" w:w="1728"/>
-          </w:tcPr>
-          <w:p>
-            <w:r>
-              <w:t>Add error &amp; empty states</w:t>
-            </w:r>
-          </w:p>
-        </w:tc>
-        <w:tc>
-          <w:tcPr>
-            <w:tcW w:type="dxa" w:w="1728"/>
-          </w:tcPr>
-          <w:p>
-            <w:r>
-              <w:t>🔲 Pending</w:t>
-            </w:r>
-          </w:p>
-        </w:tc>
-        <w:tc>
-          <w:tcPr>
-            <w:tcW w:type="dxa" w:w="1728"/>
-          </w:tcPr>
-          <w:p>
-            <w:r>
-              <w:t>Same UI</w:t>
-            </w:r>
-          </w:p>
-        </w:tc>
-        <w:tc>
-          <w:tcPr>
-            <w:tcW w:type="dxa" w:w="1728"/>
-          </w:tcPr>
-          <w:p>
-            <w:r>
-              <w:t>Same UI</w:t>
-            </w:r>
-          </w:p>
-        </w:tc>
-      </w:tr>
-      <w:tr>
-        <w:tc>
-          <w:tcPr>
-            <w:tcW w:type="dxa" w:w="1728"/>
-          </w:tcPr>
-          <w:p>
-            <w:r>
-              <w:t>13</w:t>
-            </w:r>
-          </w:p>
-        </w:tc>
-        <w:tc>
-          <w:tcPr>
-            <w:tcW w:type="dxa" w:w="1728"/>
-          </w:tcPr>
-          <w:p>
-            <w:r>
-              <w:t>Build Global Search</w:t>
-            </w:r>
-          </w:p>
-        </w:tc>
-        <w:tc>
-          <w:tcPr>
-            <w:tcW w:type="dxa" w:w="1728"/>
-          </w:tcPr>
-          <w:p>
-            <w:r>
-              <w:t>🔲 Pending</w:t>
-            </w:r>
-          </w:p>
-        </w:tc>
-        <w:tc>
-          <w:tcPr>
-            <w:tcW w:type="dxa" w:w="1728"/>
-          </w:tcPr>
-          <w:p>
-            <w:r>
-              <w:t>Same UI</w:t>
-            </w:r>
-          </w:p>
-        </w:tc>
-        <w:tc>
-          <w:tcPr>
-            <w:tcW w:type="dxa" w:w="1728"/>
-          </w:tcPr>
-          <w:p>
-            <w:r>
-              <w:t>Same UI</w:t>
-            </w:r>
-          </w:p>
-        </w:tc>
-      </w:tr>
-      <w:tr>
-        <w:tc>
-          <w:tcPr>
-            <w:tcW w:type="dxa" w:w="1728"/>
-          </w:tcPr>
-          <w:p>
-            <w:r>
-              <w:t>14</w:t>
-            </w:r>
-          </w:p>
-        </w:tc>
-        <w:tc>
-          <w:tcPr>
-            <w:tcW w:type="dxa" w:w="1728"/>
-          </w:tcPr>
-          <w:p>
-            <w:r>
-              <w:t>Build Notifications Panel</w:t>
-            </w:r>
-          </w:p>
-        </w:tc>
-        <w:tc>
-          <w:tcPr>
-            <w:tcW w:type="dxa" w:w="1728"/>
-          </w:tcPr>
-          <w:p>
-            <w:r>
-              <w:t>🔲 Pending</w:t>
-            </w:r>
-          </w:p>
-        </w:tc>
-        <w:tc>
-          <w:tcPr>
-            <w:tcW w:type="dxa" w:w="1728"/>
-          </w:tcPr>
-          <w:p>
-            <w:r>
-              <w:t>Same UI</w:t>
-            </w:r>
-          </w:p>
-        </w:tc>
-        <w:tc>
-          <w:tcPr>
-            <w:tcW w:type="dxa" w:w="1728"/>
-          </w:tcPr>
-          <w:p>
-            <w:r>
-              <w:t>Same UI</w:t>
-            </w:r>
-          </w:p>
-        </w:tc>
-      </w:tr>
-    </w:tbl>
-    <w:p/>
-    <w:p>
-      <w:pPr>
-        <w:pStyle w:val="Heading2"/>
-      </w:pPr>
-      <w:r>
-        <w:t>🟠 MEDIUM — Portal Architecture Cleanup</w:t>
-      </w:r>
-    </w:p>
-    <w:tbl>
-      <w:tblPr>
-        <w:tblStyle w:val="LightGrid-Accent1"/>
-        <w:tblW w:type="auto" w:w="0"/>
-        <w:tblLook w:firstColumn="1" w:firstRow="1" w:lastColumn="0" w:lastRow="0" w:noHBand="0" w:noVBand="1" w:val="04A0"/>
-      </w:tblPr>
-      <w:tblGrid>
-        <w:gridCol w:w="1728"/>
-        <w:gridCol w:w="1728"/>
-        <w:gridCol w:w="1728"/>
-        <w:gridCol w:w="1728"/>
-        <w:gridCol w:w="1728"/>
-      </w:tblGrid>
-      <w:tr>
-        <w:tc>
-          <w:tcPr>
-            <w:tcW w:type="dxa" w:w="1728"/>
-          </w:tcPr>
-          <w:p>
-            <w:r>
-              <w:t>#</w:t>
-            </w:r>
-          </w:p>
-        </w:tc>
-        <w:tc>
-          <w:tcPr>
-            <w:tcW w:type="dxa" w:w="1728"/>
-          </w:tcPr>
-          <w:p>
-            <w:r>
-              <w:t>Change</w:t>
-            </w:r>
-          </w:p>
-        </w:tc>
-        <w:tc>
-          <w:tcPr>
-            <w:tcW w:type="dxa" w:w="1728"/>
-          </w:tcPr>
-          <w:p>
-            <w:r>
-              <w:t>Status</w:t>
-            </w:r>
-          </w:p>
-        </w:tc>
-        <w:tc>
-          <w:tcPr>
-            <w:tcW w:type="dxa" w:w="1728"/>
-          </w:tcPr>
-          <w:p>
-            <w:r>
-              <w:t>Dev</w:t>
-            </w:r>
-          </w:p>
-        </w:tc>
-        <w:tc>
-          <w:tcPr>
-            <w:tcW w:type="dxa" w:w="1728"/>
-          </w:tcPr>
-          <w:p>
-            <w:r>
-              <w:t>Production (Render)</w:t>
-            </w:r>
-          </w:p>
-        </w:tc>
-      </w:tr>
-      <w:tr>
-        <w:tc>
-          <w:tcPr>
-            <w:tcW w:type="dxa" w:w="1728"/>
-          </w:tcPr>
-          <w:p>
-            <w:r>
-              <w:t>16</w:t>
-            </w:r>
-          </w:p>
-        </w:tc>
-        <w:tc>
-          <w:tcPr>
-            <w:tcW w:type="dxa" w:w="1728"/>
-          </w:tcPr>
-          <w:p>
-            <w:r>
-              <w:t>Extract shared portal layout into template</w:t>
-            </w:r>
-          </w:p>
-        </w:tc>
-        <w:tc>
-          <w:tcPr>
-            <w:tcW w:type="dxa" w:w="1728"/>
-          </w:tcPr>
-          <w:p>
-            <w:r>
-              <w:t>🔲 Pending</w:t>
-            </w:r>
-          </w:p>
-        </w:tc>
-        <w:tc>
-          <w:tcPr>
-            <w:tcW w:type="dxa" w:w="1728"/>
-          </w:tcPr>
-          <w:p>
-            <w:r>
-              <w:t>Same</w:t>
-            </w:r>
-          </w:p>
-        </w:tc>
-        <w:tc>
-          <w:tcPr>
-            <w:tcW w:type="dxa" w:w="1728"/>
-          </w:tcPr>
-          <w:p>
-            <w:r>
-              <w:t>Same</w:t>
-            </w:r>
-          </w:p>
-        </w:tc>
-      </w:tr>
-      <w:tr>
-        <w:tc>
-          <w:tcPr>
-            <w:tcW w:type="dxa" w:w="1728"/>
-          </w:tcPr>
-          <w:p>
-            <w:r>
-              <w:t>17</w:t>
-            </w:r>
-          </w:p>
-        </w:tc>
-        <w:tc>
-          <w:tcPr>
-            <w:tcW w:type="dxa" w:w="1728"/>
-          </w:tcPr>
-          <w:p>
-            <w:r>
-              <w:t>Unify portal navigation in dss-core.js</w:t>
-            </w:r>
-          </w:p>
-        </w:tc>
-        <w:tc>
-          <w:tcPr>
-            <w:tcW w:type="dxa" w:w="1728"/>
-          </w:tcPr>
-          <w:p>
-            <w:r>
-              <w:t>🔲 Pending</w:t>
-            </w:r>
-          </w:p>
-        </w:tc>
-        <w:tc>
-          <w:tcPr>
-            <w:tcW w:type="dxa" w:w="1728"/>
-          </w:tcPr>
-          <w:p>
-            <w:r>
-              <w:t>Same</w:t>
-            </w:r>
-          </w:p>
-        </w:tc>
-        <w:tc>
-          <w:tcPr>
-            <w:tcW w:type="dxa" w:w="1728"/>
-          </w:tcPr>
-          <w:p>
-            <w:r>
-              <w:t>Same</w:t>
-            </w:r>
-          </w:p>
-        </w:tc>
-      </w:tr>
-      <w:tr>
-        <w:tc>
-          <w:tcPr>
-            <w:tcW w:type="dxa" w:w="1728"/>
-          </w:tcPr>
-          <w:p>
-            <w:r>
-              <w:t>18</w:t>
-            </w:r>
-          </w:p>
-        </w:tc>
-        <w:tc>
-          <w:tcPr>
-            <w:tcW w:type="dxa" w:w="1728"/>
-          </w:tcPr>
-          <w:p>
-            <w:r>
-              <w:t>Extract inline CSS into dss-shared.css</w:t>
-            </w:r>
-          </w:p>
-        </w:tc>
-        <w:tc>
-          <w:tcPr>
-            <w:tcW w:type="dxa" w:w="1728"/>
-          </w:tcPr>
-          <w:p>
-            <w:r>
-              <w:t>🔲 Pending</w:t>
-            </w:r>
-          </w:p>
-        </w:tc>
-        <w:tc>
-          <w:tcPr>
-            <w:tcW w:type="dxa" w:w="1728"/>
-          </w:tcPr>
-          <w:p>
-            <w:r>
-              <w:t>Same</w:t>
-            </w:r>
-          </w:p>
-        </w:tc>
-        <w:tc>
-          <w:tcPr>
-            <w:tcW w:type="dxa" w:w="1728"/>
-          </w:tcPr>
-          <w:p>
-            <w:r>
-              <w:t>Same</w:t>
-            </w:r>
-          </w:p>
-        </w:tc>
-      </w:tr>
-      <w:tr>
-        <w:tc>
-          <w:tcPr>
-            <w:tcW w:type="dxa" w:w="1728"/>
-          </w:tcPr>
-          <w:p>
-            <w:r>
-              <w:t>19</w:t>
-            </w:r>
-          </w:p>
-        </w:tc>
-        <w:tc>
-          <w:tcPr>
-            <w:tcW w:type="dxa" w:w="1728"/>
-          </w:tcPr>
-          <w:p>
-            <w:r>
-              <w:t>Consolidate scenario engine code</w:t>
-            </w:r>
-          </w:p>
-        </w:tc>
-        <w:tc>
-          <w:tcPr>
-            <w:tcW w:type="dxa" w:w="1728"/>
-          </w:tcPr>
-          <w:p>
-            <w:r>
-              <w:t>🔲 Pending</w:t>
-            </w:r>
-          </w:p>
-        </w:tc>
-        <w:tc>
-          <w:tcPr>
-            <w:tcW w:type="dxa" w:w="1728"/>
-          </w:tcPr>
-          <w:p>
-            <w:r>
-              <w:t>Same</w:t>
-            </w:r>
-          </w:p>
-        </w:tc>
-        <w:tc>
-          <w:tcPr>
-            <w:tcW w:type="dxa" w:w="1728"/>
-          </w:tcPr>
-          <w:p>
-            <w:r>
-              <w:t>Same</w:t>
-            </w:r>
-          </w:p>
-        </w:tc>
-      </w:tr>
-      <w:tr>
-        <w:tc>
-          <w:tcPr>
-            <w:tcW w:type="dxa" w:w="1728"/>
-          </w:tcPr>
-          <w:p>
-            <w:r>
-              <w:t>20</w:t>
-            </w:r>
-          </w:p>
-        </w:tc>
-        <w:tc>
-          <w:tcPr>
-            <w:tcW w:type="dxa" w:w="1728"/>
-          </w:tcPr>
-          <w:p>
-            <w:r>
-              <w:t>Consolidate playbook rendering</w:t>
-            </w:r>
-          </w:p>
-        </w:tc>
-        <w:tc>
-          <w:tcPr>
-            <w:tcW w:type="dxa" w:w="1728"/>
-          </w:tcPr>
-          <w:p>
-            <w:r>
-              <w:t>🔲 Pending</w:t>
-            </w:r>
-          </w:p>
-        </w:tc>
-        <w:tc>
-          <w:tcPr>
-            <w:tcW w:type="dxa" w:w="1728"/>
-          </w:tcPr>
-          <w:p>
-            <w:r>
-              <w:t>Same</w:t>
-            </w:r>
-          </w:p>
-        </w:tc>
-        <w:tc>
-          <w:tcPr>
-            <w:tcW w:type="dxa" w:w="1728"/>
-          </w:tcPr>
-          <w:p>
-            <w:r>
-              <w:t>Same</w:t>
-            </w:r>
-          </w:p>
-        </w:tc>
-      </w:tr>
-    </w:tbl>
-    <w:p/>
-    <w:p>
-      <w:pPr>
-        <w:pStyle w:val="Heading2"/>
-      </w:pPr>
-      <w:r>
-        <w:t>🟢 MEDIUM-LOW — Data &amp; Feature Completion</w:t>
-      </w:r>
-    </w:p>
-    <w:tbl>
-      <w:tblPr>
-        <w:tblStyle w:val="LightGrid-Accent1"/>
-        <w:tblW w:type="auto" w:w="0"/>
-        <w:tblLook w:firstColumn="1" w:firstRow="1" w:lastColumn="0" w:lastRow="0" w:noHBand="0" w:noVBand="1" w:val="04A0"/>
-      </w:tblPr>
-      <w:tblGrid>
-        <w:gridCol w:w="1728"/>
-        <w:gridCol w:w="1728"/>
-        <w:gridCol w:w="1728"/>
-        <w:gridCol w:w="1728"/>
-        <w:gridCol w:w="1728"/>
-      </w:tblGrid>
-      <w:tr>
-        <w:tc>
-          <w:tcPr>
-            <w:tcW w:type="dxa" w:w="1728"/>
-          </w:tcPr>
-          <w:p>
-            <w:r>
-              <w:t>#</w:t>
-            </w:r>
-          </w:p>
-        </w:tc>
-        <w:tc>
-          <w:tcPr>
-            <w:tcW w:type="dxa" w:w="1728"/>
-          </w:tcPr>
-          <w:p>
-            <w:r>
-              <w:t>Change</w:t>
-            </w:r>
-          </w:p>
-        </w:tc>
-        <w:tc>
-          <w:tcPr>
-            <w:tcW w:type="dxa" w:w="1728"/>
-          </w:tcPr>
-          <w:p>
-            <w:r>
-              <w:t>Status</w:t>
-            </w:r>
-          </w:p>
-        </w:tc>
-        <w:tc>
-          <w:tcPr>
-            <w:tcW w:type="dxa" w:w="1728"/>
-          </w:tcPr>
-          <w:p>
-            <w:r>
-              <w:t>Dev</w:t>
-            </w:r>
-          </w:p>
-        </w:tc>
-        <w:tc>
-          <w:tcPr>
-            <w:tcW w:type="dxa" w:w="1728"/>
-          </w:tcPr>
-          <w:p>
-            <w:r>
-              <w:t>Production (Render)</w:t>
-            </w:r>
-          </w:p>
-        </w:tc>
-      </w:tr>
-      <w:tr>
-        <w:tc>
-          <w:tcPr>
-            <w:tcW w:type="dxa" w:w="1728"/>
-          </w:tcPr>
-          <w:p>
-            <w:r>
-              <w:t>21</w:t>
-            </w:r>
-          </w:p>
-        </w:tc>
-        <w:tc>
-          <w:tcPr>
-            <w:tcW w:type="dxa" w:w="1728"/>
-          </w:tcPr>
-          <w:p>
-            <w:r>
-              <w:t>Build decision data model (JSON/API)</w:t>
-            </w:r>
-          </w:p>
-        </w:tc>
-        <w:tc>
-          <w:tcPr>
-            <w:tcW w:type="dxa" w:w="1728"/>
-          </w:tcPr>
-          <w:p>
-            <w:r>
-              <w:t>✅ Done</w:t>
-            </w:r>
-          </w:p>
-        </w:tc>
-        <w:tc>
-          <w:tcPr>
-            <w:tcW w:type="dxa" w:w="1728"/>
-          </w:tcPr>
-          <w:p>
-            <w:r>
-              <w:t>Same</w:t>
-            </w:r>
-          </w:p>
-        </w:tc>
-        <w:tc>
-          <w:tcPr>
-            <w:tcW w:type="dxa" w:w="1728"/>
-          </w:tcPr>
-          <w:p>
-            <w:r>
-              <w:t>Same</w:t>
-            </w:r>
-          </w:p>
-        </w:tc>
-      </w:tr>
-      <w:tr>
-        <w:tc>
-          <w:tcPr>
-            <w:tcW w:type="dxa" w:w="1728"/>
-          </w:tcPr>
-          <w:p>
-            <w:r>
-              <w:t>22</w:t>
-            </w:r>
-          </w:p>
-        </w:tc>
-        <w:tc>
-          <w:tcPr>
-            <w:tcW w:type="dxa" w:w="1728"/>
-          </w:tcPr>
-          <w:p>
-            <w:r>
-              <w:t>Add /api/decisions endpoint</w:t>
-            </w:r>
-          </w:p>
-        </w:tc>
-        <w:tc>
-          <w:tcPr>
-            <w:tcW w:type="dxa" w:w="1728"/>
-          </w:tcPr>
-          <w:p>
-            <w:r>
-              <w:t>✅ Done</w:t>
-            </w:r>
-          </w:p>
-        </w:tc>
-        <w:tc>
-          <w:tcPr>
-            <w:tcW w:type="dxa" w:w="1728"/>
-          </w:tcPr>
-          <w:p>
-            <w:r>
-              <w:t>Same</w:t>
-            </w:r>
-          </w:p>
-        </w:tc>
-        <w:tc>
-          <w:tcPr>
-            <w:tcW w:type="dxa" w:w="1728"/>
-          </w:tcPr>
-          <w:p>
-            <w:r>
-              <w:t>Same</w:t>
-            </w:r>
-          </w:p>
-        </w:tc>
-      </w:tr>
-      <w:tr>
-        <w:tc>
-          <w:tcPr>
-            <w:tcW w:type="dxa" w:w="1728"/>
-          </w:tcPr>
-          <w:p>
-            <w:r>
-              <w:t>23</w:t>
-            </w:r>
-          </w:p>
-        </w:tc>
-        <w:tc>
-          <w:tcPr>
-            <w:tcW w:type="dxa" w:w="1728"/>
-          </w:tcPr>
-          <w:p>
-            <w:r>
-              <w:t>Add outcome tracking data model</w:t>
-            </w:r>
-          </w:p>
-        </w:tc>
-        <w:tc>
-          <w:tcPr>
-            <w:tcW w:type="dxa" w:w="1728"/>
-          </w:tcPr>
-          <w:p>
-            <w:r>
-              <w:t>🔲 Pending</w:t>
-            </w:r>
-          </w:p>
-        </w:tc>
-        <w:tc>
-          <w:tcPr>
-            <w:tcW w:type="dxa" w:w="1728"/>
-          </w:tcPr>
-          <w:p>
-            <w:r>
-              <w:t>Same</w:t>
-            </w:r>
-          </w:p>
-        </w:tc>
-        <w:tc>
-          <w:tcPr>
-            <w:tcW w:type="dxa" w:w="1728"/>
-          </w:tcPr>
-          <w:p>
-            <w:r>
-              <w:t>Same</w:t>
-            </w:r>
-          </w:p>
-        </w:tc>
-      </w:tr>
-      <w:tr>
-        <w:tc>
-          <w:tcPr>
-            <w:tcW w:type="dxa" w:w="1728"/>
-          </w:tcPr>
-          <w:p>
-            <w:r>
-              <w:t>24</w:t>
-            </w:r>
-          </w:p>
-        </w:tc>
-        <w:tc>
-          <w:tcPr>
-            <w:tcW w:type="dxa" w:w="1728"/>
-          </w:tcPr>
-          <w:p>
-            <w:r>
-              <w:t>Implement Cross-Portal Event System</w:t>
-            </w:r>
-          </w:p>
-        </w:tc>
-        <w:tc>
-          <w:tcPr>
-            <w:tcW w:type="dxa" w:w="1728"/>
-          </w:tcPr>
-          <w:p>
-            <w:r>
-              <w:t>🔲 Pending</w:t>
-            </w:r>
-          </w:p>
-        </w:tc>
-        <w:tc>
-          <w:tcPr>
-            <w:tcW w:type="dxa" w:w="1728"/>
-          </w:tcPr>
-          <w:p>
-            <w:r>
-              <w:t>Same</w:t>
-            </w:r>
-          </w:p>
-        </w:tc>
-        <w:tc>
-          <w:tcPr>
-            <w:tcW w:type="dxa" w:w="1728"/>
-          </w:tcPr>
-          <w:p>
-            <w:r>
-              <w:t>Same</w:t>
-            </w:r>
-          </w:p>
-        </w:tc>
-      </w:tr>
-      <w:tr>
-        <w:tc>
-          <w:tcPr>
-            <w:tcW w:type="dxa" w:w="1728"/>
-          </w:tcPr>
-          <w:p>
-            <w:r>
-              <w:t>25</w:t>
-            </w:r>
-          </w:p>
-        </w:tc>
-        <w:tc>
-          <w:tcPr>
-            <w:tcW w:type="dxa" w:w="1728"/>
-          </w:tcPr>
-          <w:p>
-            <w:r>
-              <w:t>Connect Context &amp; Insights panel</w:t>
-            </w:r>
-          </w:p>
-        </w:tc>
-        <w:tc>
-          <w:tcPr>
-            <w:tcW w:type="dxa" w:w="1728"/>
-          </w:tcPr>
-          <w:p>
-            <w:r>
-              <w:t>🔲 Pending</w:t>
-            </w:r>
-          </w:p>
-        </w:tc>
-        <w:tc>
-          <w:tcPr>
-            <w:tcW w:type="dxa" w:w="1728"/>
-          </w:tcPr>
-          <w:p>
-            <w:r>
-              <w:t>Same</w:t>
-            </w:r>
-          </w:p>
-        </w:tc>
-        <w:tc>
-          <w:tcPr>
-            <w:tcW w:type="dxa" w:w="1728"/>
-          </w:tcPr>
-          <w:p>
-            <w:r>
-              <w:t>Same</w:t>
-            </w:r>
-          </w:p>
-        </w:tc>
-      </w:tr>
-    </w:tbl>
-    <w:p/>
-    <w:p>
-      <w:pPr>
-        <w:pStyle w:val="Heading2"/>
-      </w:pPr>
-      <w:r>
-        <w:t>🔵 LOWER PRIORITY — Infrastructure &amp; Polish</w:t>
-      </w:r>
-    </w:p>
-    <w:tbl>
-      <w:tblPr>
-        <w:tblStyle w:val="LightGrid-Accent1"/>
-        <w:tblW w:type="auto" w:w="0"/>
-        <w:tblLook w:firstColumn="1" w:firstRow="1" w:lastColumn="0" w:lastRow="0" w:noHBand="0" w:noVBand="1" w:val="04A0"/>
-      </w:tblPr>
-      <w:tblGrid>
-        <w:gridCol w:w="1728"/>
-        <w:gridCol w:w="1728"/>
-        <w:gridCol w:w="1728"/>
-        <w:gridCol w:w="1728"/>
-        <w:gridCol w:w="1728"/>
-      </w:tblGrid>
-      <w:tr>
-        <w:tc>
-          <w:tcPr>
-            <w:tcW w:type="dxa" w:w="1728"/>
-          </w:tcPr>
-          <w:p>
-            <w:r>
-              <w:t>#</w:t>
-            </w:r>
-          </w:p>
-        </w:tc>
-        <w:tc>
-          <w:tcPr>
-            <w:tcW w:type="dxa" w:w="1728"/>
-          </w:tcPr>
-          <w:p>
-            <w:r>
-              <w:t>Change</w:t>
-            </w:r>
-          </w:p>
-        </w:tc>
-        <w:tc>
-          <w:tcPr>
-            <w:tcW w:type="dxa" w:w="1728"/>
-          </w:tcPr>
-          <w:p>
-            <w:r>
-              <w:t>Status</w:t>
-            </w:r>
-          </w:p>
-        </w:tc>
-        <w:tc>
-          <w:tcPr>
-            <w:tcW w:type="dxa" w:w="1728"/>
-          </w:tcPr>
-          <w:p>
-            <w:r>
-              <w:t>Dev</w:t>
-            </w:r>
-          </w:p>
-        </w:tc>
-        <w:tc>
-          <w:tcPr>
-            <w:tcW w:type="dxa" w:w="1728"/>
-          </w:tcPr>
-          <w:p>
-            <w:r>
-              <w:t>Production (Render)</w:t>
-            </w:r>
-          </w:p>
-        </w:tc>
-      </w:tr>
-      <w:tr>
-        <w:tc>
-          <w:tcPr>
-            <w:tcW w:type="dxa" w:w="1728"/>
-          </w:tcPr>
-          <w:p>
-            <w:r>
-              <w:t>26</w:t>
-            </w:r>
-          </w:p>
-        </w:tc>
-        <w:tc>
-          <w:tcPr>
-            <w:tcW w:type="dxa" w:w="1728"/>
-          </w:tcPr>
-          <w:p>
-            <w:r>
-              <w:t>Add responsive design</w:t>
-            </w:r>
-          </w:p>
-        </w:tc>
-        <w:tc>
-          <w:tcPr>
-            <w:tcW w:type="dxa" w:w="1728"/>
-          </w:tcPr>
-          <w:p>
-            <w:r>
-              <w:t>🔲 Pending</w:t>
-            </w:r>
-          </w:p>
-        </w:tc>
-        <w:tc>
-          <w:tcPr>
-            <w:tcW w:type="dxa" w:w="1728"/>
-          </w:tcPr>
-          <w:p>
-            <w:r>
-              <w:t>Same</w:t>
-            </w:r>
-          </w:p>
-        </w:tc>
-        <w:tc>
-          <w:tcPr>
-            <w:tcW w:type="dxa" w:w="1728"/>
-          </w:tcPr>
-          <w:p>
-            <w:r>
-              <w:t>Same</w:t>
-            </w:r>
-          </w:p>
-        </w:tc>
-      </w:tr>
-      <w:tr>
-        <w:tc>
-          <w:tcPr>
-            <w:tcW w:type="dxa" w:w="1728"/>
-          </w:tcPr>
-          <w:p>
-            <w:r>
-              <w:t>27</w:t>
-            </w:r>
-          </w:p>
-        </w:tc>
-        <w:tc>
-          <w:tcPr>
-            <w:tcW w:type="dxa" w:w="1728"/>
-          </w:tcPr>
-          <w:p>
-            <w:r>
-              <w:t>Add keyboard nav &amp; accessibility</w:t>
-            </w:r>
-          </w:p>
-        </w:tc>
-        <w:tc>
-          <w:tcPr>
-            <w:tcW w:type="dxa" w:w="1728"/>
-          </w:tcPr>
-          <w:p>
-            <w:r>
-              <w:t>🔲 Pending</w:t>
-            </w:r>
-          </w:p>
-        </w:tc>
-        <w:tc>
-          <w:tcPr>
-            <w:tcW w:type="dxa" w:w="1728"/>
-          </w:tcPr>
-          <w:p>
-            <w:r>
-              <w:t>Same</w:t>
-            </w:r>
-          </w:p>
-        </w:tc>
-        <w:tc>
-          <w:tcPr>
-            <w:tcW w:type="dxa" w:w="1728"/>
-          </w:tcPr>
-          <w:p>
-            <w:r>
-              <w:t>Same</w:t>
-            </w:r>
-          </w:p>
-        </w:tc>
-      </w:tr>
-      <w:tr>
-        <w:tc>
-          <w:tcPr>
-            <w:tcW w:type="dxa" w:w="1728"/>
-          </w:tcPr>
-          <w:p>
-            <w:r>
-              <w:t>28</w:t>
-            </w:r>
-          </w:p>
-        </w:tc>
-        <w:tc>
-          <w:tcPr>
-            <w:tcW w:type="dxa" w:w="1728"/>
-          </w:tcPr>
-          <w:p>
-            <w:r>
-              <w:t>Smooth scenario toggle animation</w:t>
-            </w:r>
-          </w:p>
-        </w:tc>
-        <w:tc>
-          <w:tcPr>
-            <w:tcW w:type="dxa" w:w="1728"/>
-          </w:tcPr>
-          <w:p>
-            <w:r>
-              <w:t>🔲 Pending</w:t>
-            </w:r>
-          </w:p>
-        </w:tc>
-        <w:tc>
-          <w:tcPr>
-            <w:tcW w:type="dxa" w:w="1728"/>
-          </w:tcPr>
-          <w:p>
-            <w:r>
-              <w:t>Same</w:t>
-            </w:r>
-          </w:p>
-        </w:tc>
-        <w:tc>
-          <w:tcPr>
-            <w:tcW w:type="dxa" w:w="1728"/>
-          </w:tcPr>
-          <w:p>
-            <w:r>
-              <w:t>Same</w:t>
-            </w:r>
-          </w:p>
-        </w:tc>
-      </w:tr>
-      <w:tr>
-        <w:tc>
-          <w:tcPr>
-            <w:tcW w:type="dxa" w:w="1728"/>
-          </w:tcPr>
-          <w:p>
-            <w:r>
-              <w:t>29</w:t>
-            </w:r>
-          </w:p>
-        </w:tc>
-        <w:tc>
-          <w:tcPr>
-            <w:tcW w:type="dxa" w:w="1728"/>
-          </w:tcPr>
-          <w:p>
-            <w:r>
-              <w:t>Add CSV import</w:t>
-            </w:r>
-          </w:p>
-        </w:tc>
-        <w:tc>
-          <w:tcPr>
-            <w:tcW w:type="dxa" w:w="1728"/>
-          </w:tcPr>
-          <w:p>
-            <w:r>
-              <w:t>🔲 Pending</w:t>
-            </w:r>
-          </w:p>
-        </w:tc>
-        <w:tc>
-          <w:tcPr>
-            <w:tcW w:type="dxa" w:w="1728"/>
-          </w:tcPr>
-          <w:p>
-            <w:r>
-              <w:t>Same</w:t>
-            </w:r>
-          </w:p>
-        </w:tc>
-        <w:tc>
-          <w:tcPr>
-            <w:tcW w:type="dxa" w:w="1728"/>
-          </w:tcPr>
-          <w:p>
-            <w:r>
-              <w:t>Same</w:t>
-            </w:r>
-          </w:p>
-        </w:tc>
-      </w:tr>
-      <w:tr>
-        <w:tc>
-          <w:tcPr>
-            <w:tcW w:type="dxa" w:w="1728"/>
-          </w:tcPr>
-          <w:p>
-            <w:r>
-              <w:t>30</w:t>
-            </w:r>
-          </w:p>
-        </w:tc>
-        <w:tc>
-          <w:tcPr>
-            <w:tcW w:type="dxa" w:w="1728"/>
-          </w:tcPr>
-          <w:p>
-            <w:r>
-              <w:t>Add PDF export (Puppeteer)</w:t>
-            </w:r>
-          </w:p>
-        </w:tc>
-        <w:tc>
-          <w:tcPr>
-            <w:tcW w:type="dxa" w:w="1728"/>
-          </w:tcPr>
-          <w:p>
-            <w:r>
-              <w:t>🔲 Pending</w:t>
-            </w:r>
-          </w:p>
-        </w:tc>
-        <w:tc>
-          <w:tcPr>
-            <w:tcW w:type="dxa" w:w="1728"/>
-          </w:tcPr>
-          <w:p>
-            <w:r>
-              <w:t>Same</w:t>
-            </w:r>
-          </w:p>
-        </w:tc>
-        <w:tc>
-          <w:tcPr>
-            <w:tcW w:type="dxa" w:w="1728"/>
-          </w:tcPr>
-          <w:p>
-            <w:r>
-              <w:t>Same + needs build</w:t>
-            </w:r>
-          </w:p>
-        </w:tc>
-      </w:tr>
-      <w:tr>
-        <w:tc>
-          <w:tcPr>
-            <w:tcW w:type="dxa" w:w="1728"/>
-          </w:tcPr>
-          <w:p>
-            <w:r>
-              <w:t>31</w:t>
-            </w:r>
-          </w:p>
-        </w:tc>
-        <w:tc>
-          <w:tcPr>
-            <w:tcW w:type="dxa" w:w="1728"/>
-          </w:tcPr>
-          <w:p>
-            <w:r>
-              <w:t>Add test suite</w:t>
-            </w:r>
-          </w:p>
-        </w:tc>
-        <w:tc>
-          <w:tcPr>
-            <w:tcW w:type="dxa" w:w="1728"/>
-          </w:tcPr>
-          <w:p>
-            <w:r>
-              <w:t>🔲 Pending</w:t>
-            </w:r>
-          </w:p>
-        </w:tc>
-        <w:tc>
-          <w:tcPr>
-            <w:tcW w:type="dxa" w:w="1728"/>
-          </w:tcPr>
-          <w:p>
-            <w:r>
-              <w:t>Same</w:t>
-            </w:r>
-          </w:p>
-        </w:tc>
-        <w:tc>
-          <w:tcPr>
-            <w:tcW w:type="dxa" w:w="1728"/>
-          </w:tcPr>
-          <w:p>
-            <w:r>
-              <w:t>Same</w:t>
-            </w:r>
-          </w:p>
-        </w:tc>
-      </w:tr>
-      <w:tr>
-        <w:tc>
-          <w:tcPr>
-            <w:tcW w:type="dxa" w:w="1728"/>
-          </w:tcPr>
-          <w:p>
-            <w:r>
-              <w:t>32</w:t>
-            </w:r>
-          </w:p>
-        </w:tc>
-        <w:tc>
-          <w:tcPr>
-            <w:tcW w:type="dxa" w:w="1728"/>
-          </w:tcPr>
-          <w:p>
-            <w:r>
-              <w:t>Add CI/CD pipeline</w:t>
-            </w:r>
-          </w:p>
-        </w:tc>
-        <w:tc>
-          <w:tcPr>
-            <w:tcW w:type="dxa" w:w="1728"/>
-          </w:tcPr>
-          <w:p>
-            <w:r>
-              <w:t>🔲 Pending</w:t>
-            </w:r>
-          </w:p>
-        </w:tc>
-        <w:tc>
-          <w:tcPr>
-            <w:tcW w:type="dxa" w:w="1728"/>
-          </w:tcPr>
-          <w:p>
-            <w:r>
-              <w:t>Local only</w:t>
-            </w:r>
-          </w:p>
-        </w:tc>
-        <w:tc>
-          <w:tcPr>
-            <w:tcW w:type="dxa" w:w="1728"/>
-          </w:tcPr>
-          <w:p>
-            <w:r>
-              <w:t>GitHub Actions secrets</w:t>
-            </w:r>
-          </w:p>
-        </w:tc>
-      </w:tr>
-      <w:tr>
-        <w:tc>
-          <w:tcPr>
-            <w:tcW w:type="dxa" w:w="1728"/>
-          </w:tcPr>
-          <w:p>
-            <w:r>
-              <w:t>33</w:t>
-            </w:r>
-          </w:p>
-        </w:tc>
-        <w:tc>
-          <w:tcPr>
-            <w:tcW w:type="dxa" w:w="1728"/>
-          </w:tcPr>
-          <w:p>
-            <w:r>
-              <w:t>Supabase migration (auth + DB)</w:t>
-            </w:r>
-          </w:p>
-        </w:tc>
-        <w:tc>
-          <w:tcPr>
-            <w:tcW w:type="dxa" w:w="1728"/>
-          </w:tcPr>
-          <w:p>
-            <w:r>
-              <w:t>🔲 Pending</w:t>
-            </w:r>
-          </w:p>
-        </w:tc>
-        <w:tc>
-          <w:tcPr>
-            <w:tcW w:type="dxa" w:w="1728"/>
-          </w:tcPr>
-          <w:p>
-            <w:r>
-              <w:t>Local Supabase</w:t>
-            </w:r>
-          </w:p>
-        </w:tc>
-        <w:tc>
-          <w:tcPr>
-            <w:tcW w:type="dxa" w:w="1728"/>
-          </w:tcPr>
-          <w:p>
-            <w:r>
-              <w:t>Render env vars needed</w:t>
-            </w:r>
-          </w:p>
-        </w:tc>
-      </w:tr>
-    </w:tbl>
-    <w:p/>
-    <w:p>
-      <w:pPr>
-        <w:pStyle w:val="Heading2"/>
-      </w:pPr>
-      <w:r>
-        <w:t>Summary</w:t>
+        <w:t>### 🟡 HIGH — UX Redesign (from Decision System Lab spec)</w:t>
       </w:r>
     </w:p>
     <w:p>
       <w:r>
-        <w:rPr>
-          <w:b/>
-          <w:color w:val="003399"/>
-          <w:sz w:val="24"/>
-        </w:rPr>
-        <w:t>7 done | 2 skipped | 24 remaining</w:t>
+        <w:t>| # | Change | Status | Dev | Production (Render) |</w:t>
+      </w:r>
+    </w:p>
+    <w:p>
+      <w:r>
+        <w:t>|---|--------|--------|-----|---------------------|</w:t>
+      </w:r>
+    </w:p>
+    <w:p>
+      <w:r>
+        <w:t>| 6 | Build Decision Priority Strip | ✅ Done | Works | Works |</w:t>
+      </w:r>
+    </w:p>
+    <w:p>
+      <w:r>
+        <w:t>| 6b | Fix priority strip label/icon — signature palette colors | ✅ Done | Navy #003399 + Gold #FFCC00 | Navy #003399 + Gold #FFCC00 |</w:t>
+      </w:r>
+    </w:p>
+    <w:p>
+      <w:r>
+        <w:t>| 7 | Build structured Decision Cards | 🔲 Pending | Same UI | Same UI |</w:t>
+      </w:r>
+    </w:p>
+    <w:p>
+      <w:r>
+        <w:t>| 8 | Build Drill-Down Side Panel | 🔲 Pending | Same UI | Same UI |</w:t>
+      </w:r>
+    </w:p>
+    <w:p>
+      <w:r>
+        <w:t>| 9 | Build Domain Tabs with sub-filters | 🔲 Pending | Same UI | Same UI |</w:t>
+      </w:r>
+    </w:p>
+    <w:p>
+      <w:r>
+        <w:t>| 10 | Add Portal Switcher dropdown | 🔲 Pending | Same UI | Same UI |</w:t>
+      </w:r>
+    </w:p>
+    <w:p>
+      <w:r>
+        <w:t>| 11 | Add skeleton loading states | 🔲 Pending | Same UI | Same UI |</w:t>
+      </w:r>
+    </w:p>
+    <w:p>
+      <w:r>
+        <w:t>| 12 | Add error &amp; empty states | 🔲 Pending | Same UI | Same UI |</w:t>
+      </w:r>
+    </w:p>
+    <w:p>
+      <w:r>
+        <w:t>| 13 | Build Global Search | 🔲 Pending | Same UI | Same UI |</w:t>
+      </w:r>
+    </w:p>
+    <w:p>
+      <w:r>
+        <w:t>| 14 | Build Notifications Panel | 🔲 Pending | Same UI | Same UI |</w:t>
+      </w:r>
+    </w:p>
+    <w:p>
+      <w:r>
+        <w:t>| 15 | Build Quick Actions menu (+) | 🔲 Pending | Same UI | Same UI |</w:t>
       </w:r>
     </w:p>
     <w:p/>
     <w:p>
-      <w:pPr>
-        <w:pStyle w:val="Heading2"/>
-      </w:pPr>
       <w:r>
-        <w:t>Recent Commits</w:t>
+        <w:t>### 🟠 MEDIUM — Portal Architecture Cleanup</w:t>
       </w:r>
     </w:p>
     <w:p>
-      <w:pPr>
-        <w:pStyle w:val="ListBullet"/>
-      </w:pPr>
       <w:r>
-        <w:t>b69c5af — fix: priority strip label/icon now use signature palette (navy #003399 + gold #FFCC00)</w:t>
+        <w:t>| # | Change | Status | Dev | Production (Render) |</w:t>
       </w:r>
     </w:p>
     <w:p>
-      <w:pPr>
-        <w:pStyle w:val="ListBullet"/>
-      </w:pPr>
       <w:r>
-        <w:t>0873d69 — fix: make priority strip more compact — fit within viewport</w:t>
+        <w:t>|---|--------|--------|-----|---------------------|</w:t>
       </w:r>
     </w:p>
     <w:p>
-      <w:pPr>
-        <w:pStyle w:val="ListBullet"/>
-      </w:pPr>
       <w:r>
-        <w:t>1e33550 — feat: add Decision Priority Strip to all 7 remaining portals</w:t>
+        <w:t>| 16 | Extract shared portal layout into template | 🔲 Pending | Same | Same |</w:t>
       </w:r>
     </w:p>
     <w:p>
-      <w:pPr>
-        <w:pStyle w:val="ListBullet"/>
-      </w:pPr>
       <w:r>
-        <w:t>f2e637a — feat: add Decision Priority Strip to CEO portal</w:t>
+        <w:t>| 17 | Unify portal navigation in `dss-core.js` | 🔲 Pending | Same | Same |</w:t>
       </w:r>
     </w:p>
     <w:p>
-      <w:pPr>
-        <w:pStyle w:val="ListBullet"/>
-      </w:pPr>
       <w:r>
-        <w:t>6f8aded — fix: disable HSTS and CSP in dev — fix localhost insecure warning</w:t>
+        <w:t>| 18 | Extract inline CSS into `dss-shared.css` | 🔲 Pending | Same | Same |</w:t>
+      </w:r>
+    </w:p>
+    <w:p>
+      <w:r>
+        <w:t>| 19 | Consolidate scenario engine code | 🔲 Pending | Same | Same |</w:t>
+      </w:r>
+    </w:p>
+    <w:p>
+      <w:r>
+        <w:t>| 20 | Consolidate playbook rendering | 🔲 Pending | Same | Same |</w:t>
       </w:r>
     </w:p>
     <w:p/>
     <w:p>
-      <w:pPr>
-        <w:pStyle w:val="Heading2"/>
-      </w:pPr>
       <w:r>
-        <w:t>Recommended Next</w:t>
+        <w:t>### 🟢 MEDIUM-LOW — Data &amp; Feature Completion</w:t>
       </w:r>
     </w:p>
     <w:p>
       <w:r>
-        <w:rPr>
-          <w:b/>
-        </w:rPr>
-        <w:t>#7 — Build structured Decision Cards</w:t>
+        <w:t>| # | Change | Status | Dev | Production (Render) |</w:t>
       </w:r>
     </w:p>
     <w:p>
       <w:r>
-        <w:t>Core interaction unit per Decision System Lab spec: title, priority badge, problem summary, reason, metrics snapshot, expandable details, and action buttons.</w:t>
+        <w:t>|---|--------|--------|-----|---------------------|</w:t>
+      </w:r>
+    </w:p>
+    <w:p>
+      <w:r>
+        <w:t>| 21 | Build decision data model (JSON/API) | ✅ Done | Same | Same |</w:t>
+      </w:r>
+    </w:p>
+    <w:p>
+      <w:r>
+        <w:t>| 22 | Add `/api/decisions` endpoint | ✅ Done | Same | Same |</w:t>
+      </w:r>
+    </w:p>
+    <w:p>
+      <w:r>
+        <w:t>| 23 | Add outcome tracking data model | 🔲 Pending | Same | Same |</w:t>
+      </w:r>
+    </w:p>
+    <w:p>
+      <w:r>
+        <w:t>| 24 | Implement Cross-Portal Event System | 🔲 Pending | Same | Same |</w:t>
+      </w:r>
+    </w:p>
+    <w:p>
+      <w:r>
+        <w:t>| 25 | Connect Context &amp; Insights panel | 🔲 Pending | Same | Same |</w:t>
+      </w:r>
+    </w:p>
+    <w:p/>
+    <w:p>
+      <w:r>
+        <w:t>### 🔵 LOWER PRIORITY — Infrastructure &amp; Polish</w:t>
+      </w:r>
+    </w:p>
+    <w:p>
+      <w:r>
+        <w:t>| # | Change | Status | Dev | Production (Render) |</w:t>
+      </w:r>
+    </w:p>
+    <w:p>
+      <w:r>
+        <w:t>|---|--------|--------|-----|---------------------|</w:t>
+      </w:r>
+    </w:p>
+    <w:p>
+      <w:r>
+        <w:t>| 26 | Add responsive design | 🔲 Pending | Same | Same |</w:t>
+      </w:r>
+    </w:p>
+    <w:p>
+      <w:r>
+        <w:t>| 27 | Add keyboard nav &amp; accessibility | 🔲 Pending | Same | Same |</w:t>
+      </w:r>
+    </w:p>
+    <w:p>
+      <w:r>
+        <w:t>| 28 | Smooth scenario toggle animation | 🔲 Pending | Same | Same |</w:t>
+      </w:r>
+    </w:p>
+    <w:p>
+      <w:r>
+        <w:t>| 29 | Add CSV import | 🔲 Pending | Same | Same |</w:t>
+      </w:r>
+    </w:p>
+    <w:p>
+      <w:r>
+        <w:t>| 30 | Add PDF export (Puppeteer) | 🔲 Pending | Same | Same + needs build |</w:t>
+      </w:r>
+    </w:p>
+    <w:p>
+      <w:r>
+        <w:t>| 31 | Add test suite | 🔲 Pending | Same | Same |</w:t>
+      </w:r>
+    </w:p>
+    <w:p>
+      <w:r>
+        <w:t>| 32 | Add CI/CD pipeline | 🔲 Pending | Local only | GitHub Actions secrets |</w:t>
+      </w:r>
+    </w:p>
+    <w:p>
+      <w:r>
+        <w:t>| 33 | Supabase migration (auth + DB) | 🔲 Pending | Local Supabase | Render env vars needed |</w:t>
+      </w:r>
+    </w:p>
+    <w:p/>
+    <w:p>
+      <w:r>
+        <w:t>---</w:t>
+      </w:r>
+    </w:p>
+    <w:p>
+      <w:r>
+        <w:t>**Summary: 7 done | 2 skipped | 25 remaining**</w:t>
+      </w:r>
+    </w:p>
+    <w:p>
+      <w:r>
+        <w:t>**Which one next?**</w:t>
       </w:r>
     </w:p>
     <w:sectPr>

</xml_diff>